<commit_message>
made the reference section bigger
</commit_message>
<xml_diff>
--- a/Assessment_cover_page_with_AI_declaration.v4 (8) (2).docx
+++ b/Assessment_cover_page_with_AI_declaration.v4 (8) (2).docx
@@ -1,6 +1,6 @@
 
 <file path=word/document.xml><?xml version="1.0" encoding="utf-8"?>
-<w:document xmlns:o="urn:schemas-microsoft-com:office:office" xmlns:r="http://schemas.openxmlformats.org/officeDocument/2006/relationships" xmlns:v="urn:schemas-microsoft-com:vml" xmlns:w="http://schemas.openxmlformats.org/wordprocessingml/2006/main" xmlns:w10="urn:schemas-microsoft-com:office:word" xmlns:wp="http://schemas.openxmlformats.org/drawingml/2006/wordprocessingDrawing" xmlns:wps="http://schemas.microsoft.com/office/word/2010/wordprocessingShape" xmlns:wpg="http://schemas.microsoft.com/office/word/2010/wordprocessingGroup" xmlns:mc="http://schemas.openxmlformats.org/markup-compatibility/2006" xmlns:wp14="http://schemas.microsoft.com/office/word/2010/wordprocessingDrawing" xmlns:w14="http://schemas.microsoft.com/office/word/2010/wordml" xmlns:w15="http://schemas.microsoft.com/office/word/2012/wordml" mc:Ignorable="w14 wp14 w15">
+<w:document xmlns:o="urn:schemas-microsoft-com:office:office" xmlns:r="http://schemas.openxmlformats.org/officeDocument/2006/relationships" xmlns:v="urn:schemas-microsoft-com:vml" xmlns:w="http://schemas.openxmlformats.org/wordprocessingml/2006/main" xmlns:w10="urn:schemas-microsoft-com:office:word" xmlns:wp="http://schemas.openxmlformats.org/drawingml/2006/wordprocessingDrawing" xmlns:pic="http://schemas.openxmlformats.org/drawingml/2006/picture" xmlns:wps="http://schemas.microsoft.com/office/word/2010/wordprocessingShape" xmlns:wpg="http://schemas.microsoft.com/office/word/2010/wordprocessingGroup" xmlns:mc="http://schemas.openxmlformats.org/markup-compatibility/2006" xmlns:wp14="http://schemas.microsoft.com/office/word/2010/wordprocessingDrawing" xmlns:w14="http://schemas.microsoft.com/office/word/2010/wordml" xmlns:w15="http://schemas.microsoft.com/office/word/2012/wordml" mc:Ignorable="w14 wp14 w15">
   <w:body>
     <w:p>
       <w:pPr>
@@ -12,7 +12,7 @@
         <mc:AlternateContent>
           <mc:Choice Requires="wpg">
             <w:drawing>
-              <wp:anchor behindDoc="0" distT="0" distB="0" distL="0" distR="0" simplePos="0" locked="0" layoutInCell="0" allowOverlap="1" relativeHeight="2" wp14:anchorId="6BEA538D">
+              <wp:anchor distT="0" distB="0" distL="0" distR="0" simplePos="0" relativeHeight="2" behindDoc="0" locked="0" layoutInCell="0" allowOverlap="1" wp14:anchorId="6BEA538D">
                 <wp:simplePos x="0" y="0"/>
                 <wp:positionH relativeFrom="page">
                   <wp:posOffset>428625</wp:posOffset>
@@ -80,7 +80,7 @@
                               </w:p>
                             </w:txbxContent>
                           </wps:txbx>
-                          <wps:bodyPr lIns="0" rIns="0" tIns="0" bIns="0" anchor="ctr">
+                          <wps:bodyPr lIns="0" tIns="0" rIns="0" bIns="0" anchor="ctr">
                             <a:noAutofit/>
                           </wps:bodyPr>
                         </wps:wsp>
@@ -122,7 +122,7 @@
                               </w:p>
                             </w:txbxContent>
                           </wps:txbx>
-                          <wps:bodyPr lIns="0" rIns="0" tIns="0" bIns="0" anchor="ctr">
+                          <wps:bodyPr lIns="0" tIns="0" rIns="0" bIns="0" anchor="ctr">
                             <a:noAutofit/>
                           </wps:bodyPr>
                         </wps:wsp>
@@ -131,8 +131,8 @@
                           <wps:cNvSpPr/>
                           <wps:spPr>
                             <a:xfrm>
-                              <a:off x="0" y="10144800"/>
-                              <a:ext cx="228600" cy="258480"/>
+                              <a:off x="0" y="10145520"/>
+                              <a:ext cx="228600" cy="257760"/>
                             </a:xfrm>
                             <a:prstGeom prst="rect">
                               <a:avLst/>
@@ -164,7 +164,7 @@
                               </w:p>
                             </w:txbxContent>
                           </wps:txbx>
-                          <wps:bodyPr lIns="0" rIns="0" tIns="0" bIns="0" anchor="ctr">
+                          <wps:bodyPr lIns="0" tIns="0" rIns="0" bIns="0" anchor="ctr">
                             <a:noAutofit/>
                           </wps:bodyPr>
                         </wps:wsp>
@@ -179,7 +179,7 @@
             <w:pict>
               <v:group id="shape_0" alt="Group 1728545881" style="position:absolute;margin-left:33.75pt;margin-top:-92.15pt;width:18pt;height:819.15pt" coordorigin="675,-1843" coordsize="360,16383">
                 <v:group id="shape_0" style="position:absolute;left:675;top:-1843;width:360;height:16383">
-                  <v:rect id="shape_0" ID="Rectangle 1022607563" path="m0,0l-2147483645,0l-2147483645,-2147483646l0,-2147483646xe" stroked="f" o:allowincell="f" style="position:absolute;left:675;top:-1843;width:359;height:16381;mso-wrap-style:none;v-text-anchor:middle;mso-position-horizontal-relative:page;mso-position-vertical-relative:margin">
+                  <v:rect id="shape_0" stroked="f" o:allowincell="f" style="position:absolute;left:675;top:-1843;width:359;height:16381;mso-wrap-style:none;v-text-anchor:middle;mso-position-horizontal-relative:page;mso-position-vertical-relative:margin">
                     <v:fill o:detectmouseclick="t" on="false"/>
                     <v:stroke color="#3465a4" joinstyle="round" endcap="flat"/>
                     <v:textbox>
@@ -198,7 +198,7 @@
                     </v:textbox>
                     <w10:wrap type="none"/>
                   </v:rect>
-                  <v:rect id="shape_0" ID="Rectangle 645180660" path="m0,0l-2147483645,0l-2147483645,-2147483646l0,-2147483646xe" fillcolor="#e97132" stroked="f" o:allowincell="f" style="position:absolute;left:675;top:-1843;width:359;height:15733;mso-wrap-style:none;v-text-anchor:middle;mso-position-horizontal-relative:page;mso-position-vertical-relative:margin">
+                  <v:rect id="shape_0" fillcolor="#e97132" stroked="f" o:allowincell="f" style="position:absolute;left:675;top:-1843;width:359;height:15733;mso-wrap-style:none;v-text-anchor:middle;mso-position-horizontal-relative:page;mso-position-vertical-relative:margin">
                     <v:fill o:detectmouseclick="t" type="solid" color2="#168ecd"/>
                     <v:stroke color="#3465a4" joinstyle="round" endcap="flat"/>
                     <v:textbox>
@@ -217,7 +217,7 @@
                     </v:textbox>
                     <w10:wrap type="none"/>
                   </v:rect>
-                  <v:rect id="shape_0" ID="Rectangle 300658735" path="m0,0l-2147483645,0l-2147483645,-2147483646l0,-2147483646xe" fillcolor="#156082" stroked="f" o:allowincell="f" style="position:absolute;left:675;top:14133;width:359;height:406;mso-wrap-style:none;v-text-anchor:middle;mso-position-horizontal-relative:page;mso-position-vertical-relative:margin">
+                  <v:rect id="shape_0" fillcolor="#156082" stroked="f" o:allowincell="f" style="position:absolute;left:675;top:14134;width:359;height:405;mso-wrap-style:none;v-text-anchor:middle;mso-position-horizontal-relative:page;mso-position-vertical-relative:margin">
                     <v:fill o:detectmouseclick="t" type="solid" color2="#ea9f7d"/>
                     <v:stroke color="#3465a4" joinstyle="round" endcap="flat"/>
                     <v:textbox>
@@ -242,7 +242,7 @@
           </mc:Fallback>
         </mc:AlternateContent>
         <w:drawing>
-          <wp:anchor behindDoc="0" distT="0" distB="0" distL="114300" distR="114300" simplePos="0" locked="0" layoutInCell="0" allowOverlap="1" relativeHeight="8">
+          <wp:anchor distT="0" distB="0" distL="114300" distR="114300" simplePos="0" relativeHeight="8" behindDoc="0" locked="0" layoutInCell="0" allowOverlap="1">
             <wp:simplePos x="0" y="0"/>
             <wp:positionH relativeFrom="margin">
               <wp:posOffset>4174490</wp:posOffset>
@@ -280,6 +280,7 @@
                     <a:prstGeom prst="rect">
                       <a:avLst/>
                     </a:prstGeom>
+                    <a:noFill/>
                   </pic:spPr>
                 </pic:pic>
               </a:graphicData>
@@ -320,11 +321,11 @@
           <w:bottom w:w="0" w:type="dxa"/>
           <w:right w:w="108" w:type="dxa"/>
         </w:tblCellMar>
-        <w:tblLook w:val="0400" w:noHBand="0" w:noVBand="1" w:firstColumn="0" w:lastRow="0" w:lastColumn="0" w:firstRow="0"/>
+        <w:tblLook w:val="0400" w:firstRow="0" w:noVBand="1" w:lastRow="0" w:firstColumn="0" w:lastColumn="0" w:noHBand="0"/>
       </w:tblPr>
       <w:tblGrid>
         <w:gridCol w:w="3256"/>
-        <w:gridCol w:w="5758"/>
+        <w:gridCol w:w="5759"/>
       </w:tblGrid>
       <w:tr>
         <w:trPr/>
@@ -339,7 +340,6 @@
               <w:spacing w:lineRule="auto" w:line="480"/>
               <w:rPr>
                 <w:i/>
-                <w:i/>
                 <w:color w:val="156082"/>
                 <w:sz w:val="32"/>
                 <w:szCs w:val="32"/>
@@ -361,7 +361,6 @@
               <w:spacing w:lineRule="auto" w:line="480" w:before="0" w:after="160"/>
               <w:rPr>
                 <w:i/>
-                <w:i/>
                 <w:color w:val="156082"/>
                 <w:sz w:val="32"/>
                 <w:szCs w:val="32"/>
@@ -379,7 +378,7 @@
         </w:tc>
         <w:tc>
           <w:tcPr>
-            <w:tcW w:w="5758" w:type="dxa"/>
+            <w:tcW w:w="5759" w:type="dxa"/>
             <w:tcBorders/>
           </w:tcPr>
           <w:p>
@@ -387,7 +386,6 @@
               <w:pStyle w:val="Normal"/>
               <w:spacing w:lineRule="auto" w:line="480" w:before="0" w:after="160"/>
               <w:rPr>
-                <w:i/>
                 <w:i/>
                 <w:color w:val="156082"/>
                 <w:sz w:val="32"/>
@@ -417,7 +415,6 @@
               <w:spacing w:lineRule="auto" w:line="480"/>
               <w:rPr>
                 <w:i/>
-                <w:i/>
                 <w:color w:val="156082"/>
                 <w:sz w:val="32"/>
                 <w:szCs w:val="32"/>
@@ -439,7 +436,6 @@
               <w:spacing w:lineRule="auto" w:line="480" w:before="0" w:after="160"/>
               <w:rPr>
                 <w:i/>
-                <w:i/>
                 <w:color w:val="156082"/>
                 <w:sz w:val="32"/>
                 <w:szCs w:val="32"/>
@@ -457,7 +453,7 @@
         </w:tc>
         <w:tc>
           <w:tcPr>
-            <w:tcW w:w="5758" w:type="dxa"/>
+            <w:tcW w:w="5759" w:type="dxa"/>
             <w:tcBorders/>
           </w:tcPr>
           <w:p>
@@ -505,7 +501,6 @@
               <w:spacing w:lineRule="auto" w:line="480"/>
               <w:rPr>
                 <w:i/>
-                <w:i/>
                 <w:color w:val="156082"/>
                 <w:sz w:val="32"/>
                 <w:szCs w:val="32"/>
@@ -527,7 +522,6 @@
               <w:spacing w:lineRule="auto" w:line="480" w:before="0" w:after="160"/>
               <w:rPr>
                 <w:i/>
-                <w:i/>
                 <w:color w:val="156082"/>
                 <w:sz w:val="32"/>
                 <w:szCs w:val="32"/>
@@ -545,7 +539,7 @@
         </w:tc>
         <w:tc>
           <w:tcPr>
-            <w:tcW w:w="5758" w:type="dxa"/>
+            <w:tcW w:w="5759" w:type="dxa"/>
             <w:tcBorders/>
           </w:tcPr>
           <w:p>
@@ -553,7 +547,6 @@
               <w:pStyle w:val="Normal"/>
               <w:spacing w:lineRule="auto" w:line="480" w:before="0" w:after="160"/>
               <w:rPr>
-                <w:i/>
                 <w:i/>
                 <w:color w:val="156082"/>
                 <w:sz w:val="32"/>
@@ -583,7 +576,6 @@
               <w:spacing w:lineRule="auto" w:line="480"/>
               <w:rPr>
                 <w:i/>
-                <w:i/>
                 <w:color w:val="156082"/>
                 <w:sz w:val="32"/>
                 <w:szCs w:val="32"/>
@@ -605,7 +597,6 @@
               <w:spacing w:lineRule="auto" w:line="480" w:before="0" w:after="160"/>
               <w:rPr>
                 <w:i/>
-                <w:i/>
                 <w:color w:val="156082"/>
                 <w:sz w:val="32"/>
                 <w:szCs w:val="32"/>
@@ -623,7 +614,7 @@
         </w:tc>
         <w:tc>
           <w:tcPr>
-            <w:tcW w:w="5758" w:type="dxa"/>
+            <w:tcW w:w="5759" w:type="dxa"/>
             <w:tcBorders/>
           </w:tcPr>
           <w:p>
@@ -644,7 +635,7 @@
                 <w:szCs w:val="22"/>
                 <w:lang w:val="en-IE" w:eastAsia="en-IE" w:bidi="ar-SA"/>
               </w:rPr>
-              <w:t xml:space="preserve">CA1_DataPrep_HDip  </w:t>
+              <w:t>CA1_DataPrep_HDip</w:t>
             </w:r>
           </w:p>
         </w:tc>
@@ -662,7 +653,6 @@
               <w:spacing w:lineRule="auto" w:line="480"/>
               <w:rPr>
                 <w:i/>
-                <w:i/>
                 <w:color w:val="156082"/>
                 <w:sz w:val="32"/>
                 <w:szCs w:val="32"/>
@@ -684,7 +674,6 @@
               <w:spacing w:lineRule="auto" w:line="480" w:before="0" w:after="160"/>
               <w:rPr>
                 <w:i/>
-                <w:i/>
                 <w:color w:val="156082"/>
                 <w:sz w:val="32"/>
                 <w:szCs w:val="32"/>
@@ -702,7 +691,7 @@
         </w:tc>
         <w:tc>
           <w:tcPr>
-            <w:tcW w:w="5758" w:type="dxa"/>
+            <w:tcW w:w="5759" w:type="dxa"/>
             <w:tcBorders/>
           </w:tcPr>
           <w:p>
@@ -730,14 +719,6 @@
                 <w:shd w:fill="FFFFFF" w:val="clear"/>
               </w:rPr>
               <w:t>David McQuaid</w:t>
-            </w:r>
-            <w:r>
-              <w:rPr>
-                <w:color w:val="000000"/>
-                <w:sz w:val="32"/>
-                <w:szCs w:val="32"/>
-              </w:rPr>
-              <w:t xml:space="preserve"> </w:t>
             </w:r>
           </w:p>
         </w:tc>
@@ -755,7 +736,6 @@
               <w:spacing w:lineRule="auto" w:line="480"/>
               <w:rPr>
                 <w:i/>
-                <w:i/>
                 <w:color w:val="156082"/>
                 <w:sz w:val="32"/>
                 <w:szCs w:val="32"/>
@@ -777,7 +757,6 @@
               <w:spacing w:lineRule="auto" w:line="480" w:before="0" w:after="160"/>
               <w:rPr>
                 <w:i/>
-                <w:i/>
                 <w:color w:val="156082"/>
                 <w:sz w:val="32"/>
                 <w:szCs w:val="32"/>
@@ -795,7 +774,7 @@
         </w:tc>
         <w:tc>
           <w:tcPr>
-            <w:tcW w:w="5758" w:type="dxa"/>
+            <w:tcW w:w="5759" w:type="dxa"/>
             <w:tcBorders/>
           </w:tcPr>
           <w:p>
@@ -835,7 +814,6 @@
               <w:spacing w:lineRule="auto" w:line="480"/>
               <w:rPr>
                 <w:i/>
-                <w:i/>
                 <w:color w:val="156082"/>
                 <w:sz w:val="32"/>
                 <w:szCs w:val="32"/>
@@ -857,7 +835,6 @@
               <w:spacing w:lineRule="auto" w:line="480" w:before="0" w:after="160"/>
               <w:rPr>
                 <w:i/>
-                <w:i/>
                 <w:color w:val="156082"/>
                 <w:sz w:val="32"/>
                 <w:szCs w:val="32"/>
@@ -875,7 +852,7 @@
         </w:tc>
         <w:tc>
           <w:tcPr>
-            <w:tcW w:w="5758" w:type="dxa"/>
+            <w:tcW w:w="5759" w:type="dxa"/>
             <w:tcBorders/>
           </w:tcPr>
           <w:p>
@@ -948,7 +925,7 @@
         <mc:AlternateContent>
           <mc:Choice Requires="wps">
             <w:drawing>
-              <wp:anchor behindDoc="0" distT="14605" distB="14605" distL="15240" distR="13970" simplePos="0" locked="0" layoutInCell="0" allowOverlap="1" relativeHeight="6" wp14:anchorId="29541C15">
+              <wp:anchor distT="14605" distB="14605" distL="15240" distR="13970" simplePos="0" relativeHeight="6" behindDoc="0" locked="0" layoutInCell="0" allowOverlap="1" wp14:anchorId="29541C15">
                 <wp:simplePos x="0" y="0"/>
                 <wp:positionH relativeFrom="margin">
                   <wp:align>center</wp:align>
@@ -992,7 +969,7 @@
                         <w:txbxContent>
                           <w:p>
                             <w:pPr>
-                              <w:pStyle w:val="FrameContents"/>
+                              <w:pStyle w:val="FrameContentsuser"/>
                               <w:spacing w:lineRule="auto" w:line="259"/>
                               <w:rPr/>
                             </w:pPr>
@@ -1007,7 +984,7 @@
                           </w:p>
                           <w:p>
                             <w:pPr>
-                              <w:pStyle w:val="FrameContents"/>
+                              <w:pStyle w:val="FrameContentsuser"/>
                               <w:spacing w:lineRule="auto" w:line="259"/>
                               <w:rPr/>
                             </w:pPr>
@@ -1021,7 +998,7 @@
                           </w:p>
                           <w:p>
                             <w:pPr>
-                              <w:pStyle w:val="FrameContents"/>
+                              <w:pStyle w:val="FrameContentsuser"/>
                               <w:spacing w:lineRule="auto" w:line="259"/>
                               <w:rPr/>
                             </w:pPr>
@@ -1035,7 +1012,7 @@
                           </w:p>
                           <w:p>
                             <w:pPr>
-                              <w:pStyle w:val="FrameContents"/>
+                              <w:pStyle w:val="FrameContentsuser"/>
                               <w:spacing w:lineRule="auto" w:line="259" w:before="0" w:after="160"/>
                               <w:rPr/>
                             </w:pPr>
@@ -1067,14 +1044,14 @@
           </mc:Choice>
           <mc:Fallback>
             <w:pict>
-              <v:rect id="shape_0" ID="Rectangle 1728545882" path="m0,0l-2147483645,0l-2147483645,-2147483646l0,-2147483646xe" fillcolor="white" stroked="t" o:allowincell="f" style="position:absolute;margin-left:-2.75pt;margin-top:38.75pt;width:456.7pt;height:226.45pt;mso-wrap-style:square;v-text-anchor:top;mso-position-horizontal:center;mso-position-horizontal-relative:margin" wp14:anchorId="29541C15">
+              <v:rect id="shape_0" fillcolor="white" stroked="t" o:allowincell="f" style="position:absolute;margin-left:-2.75pt;margin-top:38.75pt;width:456.7pt;height:226.45pt;mso-wrap-style:square;v-text-anchor:top;mso-position-horizontal:center;mso-position-horizontal-relative:margin" wp14:anchorId="29541C15">
                 <v:fill o:detectmouseclick="t" type="solid" color2="black"/>
                 <v:stroke color="#156082" weight="28440" joinstyle="round" endcap="flat"/>
                 <v:textbox>
                   <w:txbxContent>
                     <w:p>
                       <w:pPr>
-                        <w:pStyle w:val="FrameContents"/>
+                        <w:pStyle w:val="FrameContentsuser"/>
                         <w:spacing w:lineRule="auto" w:line="259"/>
                         <w:rPr/>
                       </w:pPr>
@@ -1089,7 +1066,7 @@
                     </w:p>
                     <w:p>
                       <w:pPr>
-                        <w:pStyle w:val="FrameContents"/>
+                        <w:pStyle w:val="FrameContentsuser"/>
                         <w:spacing w:lineRule="auto" w:line="259"/>
                         <w:rPr/>
                       </w:pPr>
@@ -1103,7 +1080,7 @@
                     </w:p>
                     <w:p>
                       <w:pPr>
-                        <w:pStyle w:val="FrameContents"/>
+                        <w:pStyle w:val="FrameContentsuser"/>
                         <w:spacing w:lineRule="auto" w:line="259"/>
                         <w:rPr/>
                       </w:pPr>
@@ -1117,7 +1094,7 @@
                     </w:p>
                     <w:p>
                       <w:pPr>
-                        <w:pStyle w:val="FrameContents"/>
+                        <w:pStyle w:val="FrameContentsuser"/>
                         <w:spacing w:lineRule="auto" w:line="259" w:before="0" w:after="160"/>
                         <w:rPr/>
                       </w:pPr>
@@ -1155,14 +1132,8 @@
     <w:p>
       <w:pPr>
         <w:pStyle w:val="Normal"/>
+        <w:spacing w:before="0" w:after="160"/>
         <w:rPr/>
-      </w:pPr>
-      <w:r>
-        <w:rPr/>
-      </w:r>
-    </w:p>
-    <w:p>
-      <w:pPr>
         <w:sectPr>
           <w:type w:val="nextPage"/>
           <w:pgSz w:w="11906" w:h="16838"/>
@@ -1172,8 +1143,6 @@
           <w:textDirection w:val="lrTb"/>
           <w:docGrid w:type="default" w:linePitch="100" w:charSpace="0"/>
         </w:sectPr>
-        <w:pStyle w:val="Normal"/>
-        <w:rPr/>
       </w:pPr>
       <w:r>
         <w:rPr/>
@@ -1199,12 +1168,28 @@
         <w:bidi w:val="0"/>
         <w:ind w:hanging="0" w:left="0" w:right="0"/>
         <w:rPr>
-          <w:u w:val="none"/>
+          <w:rFonts w:ascii="Calibri" w:hAnsi="Calibri"/>
+          <w:sz w:val="28"/>
+          <w:szCs w:val="28"/>
         </w:rPr>
       </w:pPr>
       <w:r>
         <w:rPr>
+          <w:rFonts w:ascii="Calibri" w:hAnsi="Calibri"/>
+          <w:rFonts w:ascii="Calibri" w:hAnsi="Calibri" w:eastAsia="Calibri" w:cs="Calibri"/>
+          <w:color w:val="auto"/>
+          <w:sz w:val="28"/>
+          <w:sz w:val="22"/>
+          <w:szCs w:val="28"/>
           <w:u w:val="none"/>
+          <w:lang w:val="en-IE" w:eastAsia="en-IE" w:bidi="ar-SA"/>
+          <w:rPrChange w:id="0" w:author="Unknown Author" w:date="2026-10-19T16:16:22Z">
+            <w:rPr>
+              <w:u w:val="none"/>
+              <w:kern w:val="0"/>
+              <w:szCs w:val="22"/>
+            </w:rPr>
+          </w:rPrChange>
         </w:rPr>
         <w:t>Bellman, R. (1957) Dynamic Programming. Princeton: Princeton University Press.</w:t>
       </w:r>
@@ -1215,12 +1200,28 @@
         <w:bidi w:val="0"/>
         <w:ind w:hanging="0" w:left="0" w:right="0"/>
         <w:rPr>
-          <w:u w:val="none"/>
+          <w:rFonts w:ascii="Calibri" w:hAnsi="Calibri"/>
+          <w:sz w:val="28"/>
+          <w:szCs w:val="28"/>
         </w:rPr>
       </w:pPr>
       <w:r>
         <w:rPr>
+          <w:rFonts w:ascii="Calibri" w:hAnsi="Calibri"/>
+          <w:rFonts w:ascii="Calibri" w:hAnsi="Calibri" w:eastAsia="Calibri" w:cs="Calibri"/>
+          <w:color w:val="auto"/>
+          <w:sz w:val="28"/>
+          <w:sz w:val="22"/>
+          <w:szCs w:val="28"/>
           <w:u w:val="none"/>
+          <w:lang w:val="en-IE" w:eastAsia="en-IE" w:bidi="ar-SA"/>
+          <w:rPrChange w:id="0" w:author="Unknown Author" w:date="2026-10-19T16:16:22Z">
+            <w:rPr>
+              <w:u w:val="none"/>
+              <w:kern w:val="0"/>
+              <w:szCs w:val="22"/>
+            </w:rPr>
+          </w:rPrChange>
         </w:rPr>
         <w:t>Domingos, P. (2012) 'A few useful things to know about machine learning', Communications of the ACM, 55(10), pp. 78–87. doi:10.1145/2347736.2347755.</w:t>
       </w:r>
@@ -1231,12 +1232,28 @@
         <w:bidi w:val="0"/>
         <w:ind w:hanging="0" w:left="0" w:right="0"/>
         <w:rPr>
-          <w:u w:val="none"/>
+          <w:rFonts w:ascii="Calibri" w:hAnsi="Calibri"/>
+          <w:sz w:val="28"/>
+          <w:szCs w:val="28"/>
         </w:rPr>
       </w:pPr>
       <w:r>
         <w:rPr>
+          <w:rFonts w:ascii="Calibri" w:hAnsi="Calibri"/>
+          <w:rFonts w:ascii="Calibri" w:hAnsi="Calibri" w:eastAsia="Calibri" w:cs="Calibri"/>
+          <w:color w:val="auto"/>
+          <w:sz w:val="28"/>
+          <w:sz w:val="22"/>
+          <w:szCs w:val="28"/>
           <w:u w:val="none"/>
+          <w:lang w:val="en-IE" w:eastAsia="en-IE" w:bidi="ar-SA"/>
+          <w:rPrChange w:id="0" w:author="Unknown Author" w:date="2026-10-19T16:16:22Z">
+            <w:rPr>
+              <w:u w:val="none"/>
+              <w:kern w:val="0"/>
+              <w:szCs w:val="22"/>
+            </w:rPr>
+          </w:rPrChange>
         </w:rPr>
         <w:t>Hastie, T., Tibshirani, R. and Friedman, J. (2009) The Elements of Statistical Learning: Data Mining, Inference, and Prediction. 2nd edn. New York: Springer.</w:t>
       </w:r>
@@ -1250,12 +1267,18 @@
         <w:spacing w:lineRule="auto" w:line="259" w:before="0" w:after="160"/>
         <w:jc w:val="left"/>
         <w:rPr>
+          <w:rFonts w:ascii="Calibri" w:hAnsi="Calibri"/>
           <w:color w:val="FF0000"/>
+          <w:sz w:val="28"/>
+          <w:szCs w:val="28"/>
         </w:rPr>
       </w:pPr>
       <w:r>
         <w:rPr>
+          <w:rFonts w:ascii="Calibri" w:hAnsi="Calibri"/>
           <w:color w:val="FF0000"/>
+          <w:sz w:val="28"/>
+          <w:szCs w:val="28"/>
         </w:rPr>
       </w:r>
     </w:p>
@@ -1329,6 +1352,7 @@
     <w:sectPr>
       <w:footerReference w:type="even" r:id="rId4"/>
       <w:footerReference w:type="default" r:id="rId5"/>
+      <w:footerReference w:type="first" r:id="rId6"/>
       <w:type w:val="nextPage"/>
       <w:pgSz w:w="11906" w:h="16838"/>
       <w:pgMar w:left="1440" w:right="1440" w:gutter="0" w:header="0" w:top="1440" w:footer="708" w:bottom="1440"/>
@@ -1342,7 +1366,7 @@
 </file>
 
 <file path=word/footer1.xml><?xml version="1.0" encoding="utf-8"?>
-<w:ftr xmlns:o="urn:schemas-microsoft-com:office:office" xmlns:r="http://schemas.openxmlformats.org/officeDocument/2006/relationships" xmlns:v="urn:schemas-microsoft-com:vml" xmlns:w="http://schemas.openxmlformats.org/wordprocessingml/2006/main" xmlns:w10="urn:schemas-microsoft-com:office:word" xmlns:wp="http://schemas.openxmlformats.org/drawingml/2006/wordprocessingDrawing" xmlns:wps="http://schemas.microsoft.com/office/word/2010/wordprocessingShape" xmlns:wpg="http://schemas.microsoft.com/office/word/2010/wordprocessingGroup" xmlns:mc="http://schemas.openxmlformats.org/markup-compatibility/2006" xmlns:wp14="http://schemas.microsoft.com/office/word/2010/wordprocessingDrawing" xmlns:w14="http://schemas.microsoft.com/office/word/2010/wordml" xmlns:w15="http://schemas.microsoft.com/office/word/2012/wordml" mc:Ignorable="w14 wp14 w15">
+<w:ftr xmlns:o="urn:schemas-microsoft-com:office:office" xmlns:r="http://schemas.openxmlformats.org/officeDocument/2006/relationships" xmlns:v="urn:schemas-microsoft-com:vml" xmlns:w="http://schemas.openxmlformats.org/wordprocessingml/2006/main" xmlns:w10="urn:schemas-microsoft-com:office:word" xmlns:wp="http://schemas.openxmlformats.org/drawingml/2006/wordprocessingDrawing" xmlns:pic="http://schemas.openxmlformats.org/drawingml/2006/picture" xmlns:wps="http://schemas.microsoft.com/office/word/2010/wordprocessingShape" xmlns:wpg="http://schemas.microsoft.com/office/word/2010/wordprocessingGroup" xmlns:mc="http://schemas.openxmlformats.org/markup-compatibility/2006" xmlns:wp14="http://schemas.microsoft.com/office/word/2010/wordprocessingDrawing" xmlns:w14="http://schemas.microsoft.com/office/word/2010/wordml" xmlns:w15="http://schemas.microsoft.com/office/word/2012/wordml" mc:Ignorable="w14 wp14 w15">
   <w:p>
     <w:pPr>
       <w:pStyle w:val="Footer"/>
@@ -1356,7 +1380,51 @@
 </file>
 
 <file path=word/footer2.xml><?xml version="1.0" encoding="utf-8"?>
-<w:ftr xmlns:o="urn:schemas-microsoft-com:office:office" xmlns:r="http://schemas.openxmlformats.org/officeDocument/2006/relationships" xmlns:v="urn:schemas-microsoft-com:vml" xmlns:w="http://schemas.openxmlformats.org/wordprocessingml/2006/main" xmlns:w10="urn:schemas-microsoft-com:office:word" xmlns:wp="http://schemas.openxmlformats.org/drawingml/2006/wordprocessingDrawing" xmlns:wps="http://schemas.microsoft.com/office/word/2010/wordprocessingShape" xmlns:wpg="http://schemas.microsoft.com/office/word/2010/wordprocessingGroup" xmlns:mc="http://schemas.openxmlformats.org/markup-compatibility/2006" xmlns:wp14="http://schemas.microsoft.com/office/word/2010/wordprocessingDrawing" xmlns:w14="http://schemas.microsoft.com/office/word/2010/wordml" xmlns:w15="http://schemas.microsoft.com/office/word/2012/wordml" mc:Ignorable="w14 wp14 w15">
+<w:ftr xmlns:o="urn:schemas-microsoft-com:office:office" xmlns:r="http://schemas.openxmlformats.org/officeDocument/2006/relationships" xmlns:v="urn:schemas-microsoft-com:vml" xmlns:w="http://schemas.openxmlformats.org/wordprocessingml/2006/main" xmlns:w10="urn:schemas-microsoft-com:office:word" xmlns:wp="http://schemas.openxmlformats.org/drawingml/2006/wordprocessingDrawing" xmlns:pic="http://schemas.openxmlformats.org/drawingml/2006/picture" xmlns:wps="http://schemas.microsoft.com/office/word/2010/wordprocessingShape" xmlns:wpg="http://schemas.microsoft.com/office/word/2010/wordprocessingGroup" xmlns:mc="http://schemas.openxmlformats.org/markup-compatibility/2006" xmlns:wp14="http://schemas.microsoft.com/office/word/2010/wordprocessingDrawing" xmlns:w14="http://schemas.microsoft.com/office/word/2010/wordml" xmlns:w15="http://schemas.microsoft.com/office/word/2012/wordml" mc:Ignorable="w14 wp14 w15">
+  <w:p>
+    <w:pPr>
+      <w:pStyle w:val="Normal"/>
+      <w:tabs>
+        <w:tab w:val="clear" w:pos="720"/>
+        <w:tab w:val="center" w:pos="4513" w:leader="none"/>
+        <w:tab w:val="right" w:pos="9026" w:leader="none"/>
+      </w:tabs>
+      <w:spacing w:lineRule="auto" w:line="240" w:before="0" w:after="0"/>
+      <w:jc w:val="center"/>
+      <w:rPr>
+        <w:color w:val="000000"/>
+      </w:rPr>
+    </w:pPr>
+    <w:r>
+      <w:rPr>
+        <w:color w:val="000000"/>
+      </w:rPr>
+    </w:r>
+  </w:p>
+  <w:p>
+    <w:pPr>
+      <w:pStyle w:val="Normal"/>
+      <w:tabs>
+        <w:tab w:val="clear" w:pos="720"/>
+        <w:tab w:val="center" w:pos="4513" w:leader="none"/>
+        <w:tab w:val="right" w:pos="9026" w:leader="none"/>
+      </w:tabs>
+      <w:spacing w:lineRule="auto" w:line="240" w:before="0" w:after="0"/>
+      <w:rPr>
+        <w:color w:val="000000"/>
+      </w:rPr>
+    </w:pPr>
+    <w:r>
+      <w:rPr>
+        <w:color w:val="000000"/>
+      </w:rPr>
+    </w:r>
+  </w:p>
+</w:ftr>
+</file>
+
+<file path=word/footer3.xml><?xml version="1.0" encoding="utf-8"?>
+<w:ftr xmlns:o="urn:schemas-microsoft-com:office:office" xmlns:r="http://schemas.openxmlformats.org/officeDocument/2006/relationships" xmlns:v="urn:schemas-microsoft-com:vml" xmlns:w="http://schemas.openxmlformats.org/wordprocessingml/2006/main" xmlns:w10="urn:schemas-microsoft-com:office:word" xmlns:wp="http://schemas.openxmlformats.org/drawingml/2006/wordprocessingDrawing" xmlns:pic="http://schemas.openxmlformats.org/drawingml/2006/picture" xmlns:wps="http://schemas.microsoft.com/office/word/2010/wordprocessingShape" xmlns:wpg="http://schemas.microsoft.com/office/word/2010/wordprocessingGroup" xmlns:mc="http://schemas.openxmlformats.org/markup-compatibility/2006" xmlns:wp14="http://schemas.microsoft.com/office/word/2010/wordprocessingDrawing" xmlns:w14="http://schemas.microsoft.com/office/word/2010/wordml" xmlns:w15="http://schemas.microsoft.com/office/word/2012/wordml" mc:Ignorable="w14 wp14 w15">
   <w:p>
     <w:pPr>
       <w:pStyle w:val="Normal"/>
@@ -1815,7 +1883,7 @@
     </w:rPr>
   </w:style>
   <w:style w:type="paragraph" w:styleId="Heading1">
-    <w:name w:val="Heading 1"/>
+    <w:name w:val="heading 1"/>
     <w:basedOn w:val="Title"/>
     <w:next w:val="Normal"/>
     <w:link w:val="Heading1Char"/>
@@ -1837,7 +1905,7 @@
     </w:rPr>
   </w:style>
   <w:style w:type="paragraph" w:styleId="Heading2">
-    <w:name w:val="Heading 2"/>
+    <w:name w:val="heading 2"/>
     <w:basedOn w:val="Title"/>
     <w:next w:val="Normal"/>
     <w:link w:val="Heading2Char"/>
@@ -1860,7 +1928,7 @@
     </w:rPr>
   </w:style>
   <w:style w:type="paragraph" w:styleId="Heading3">
-    <w:name w:val="Heading 3"/>
+    <w:name w:val="heading 3"/>
     <w:basedOn w:val="Title"/>
     <w:next w:val="Normal"/>
     <w:link w:val="Heading3Char"/>
@@ -1883,7 +1951,7 @@
     </w:rPr>
   </w:style>
   <w:style w:type="paragraph" w:styleId="Heading4">
-    <w:name w:val="Heading 4"/>
+    <w:name w:val="heading 4"/>
     <w:basedOn w:val="Normal"/>
     <w:next w:val="Normal"/>
     <w:link w:val="Heading4Char"/>
@@ -1906,7 +1974,7 @@
     </w:rPr>
   </w:style>
   <w:style w:type="paragraph" w:styleId="Heading5">
-    <w:name w:val="Heading 5"/>
+    <w:name w:val="heading 5"/>
     <w:basedOn w:val="Normal"/>
     <w:next w:val="Normal"/>
     <w:link w:val="Heading5Char"/>
@@ -1927,7 +1995,7 @@
     </w:rPr>
   </w:style>
   <w:style w:type="paragraph" w:styleId="Heading6">
-    <w:name w:val="Heading 6"/>
+    <w:name w:val="heading 6"/>
     <w:basedOn w:val="Normal"/>
     <w:next w:val="Normal"/>
     <w:link w:val="Heading6Char"/>
@@ -1950,7 +2018,7 @@
     </w:rPr>
   </w:style>
   <w:style w:type="paragraph" w:styleId="Heading7">
-    <w:name w:val="Heading 7"/>
+    <w:name w:val="heading 7"/>
     <w:basedOn w:val="Normal"/>
     <w:next w:val="Normal"/>
     <w:link w:val="Heading7Char"/>
@@ -1971,7 +2039,7 @@
     </w:rPr>
   </w:style>
   <w:style w:type="paragraph" w:styleId="Heading8">
-    <w:name w:val="Heading 8"/>
+    <w:name w:val="heading 8"/>
     <w:basedOn w:val="Normal"/>
     <w:next w:val="Normal"/>
     <w:link w:val="Heading8Char"/>
@@ -1994,7 +2062,7 @@
     </w:rPr>
   </w:style>
   <w:style w:type="paragraph" w:styleId="Heading9">
-    <w:name w:val="Heading 9"/>
+    <w:name w:val="heading 9"/>
     <w:basedOn w:val="Normal"/>
     <w:next w:val="Normal"/>
     <w:link w:val="Heading9Char"/>
@@ -2293,7 +2361,7 @@
     <w:rPr/>
   </w:style>
   <w:style w:type="character" w:styleId="LineNumber">
-    <w:name w:val="Line Number"/>
+    <w:name w:val="line number"/>
     <w:rPr/>
   </w:style>
   <w:style w:type="character" w:styleId="Strong">
@@ -2344,7 +2412,7 @@
     </w:rPr>
   </w:style>
   <w:style w:type="paragraph" w:styleId="Caption">
-    <w:name w:val="Caption"/>
+    <w:name w:val="caption"/>
     <w:basedOn w:val="Normal"/>
     <w:qFormat/>
     <w:pPr>
@@ -2466,7 +2534,7 @@
     <w:rPr/>
   </w:style>
   <w:style w:type="paragraph" w:styleId="Header">
-    <w:name w:val="Header"/>
+    <w:name w:val="header"/>
     <w:basedOn w:val="Normal"/>
     <w:link w:val="HeaderChar"/>
     <w:uiPriority w:val="99"/>
@@ -2483,7 +2551,7 @@
     <w:rPr/>
   </w:style>
   <w:style w:type="paragraph" w:styleId="Footer">
-    <w:name w:val="Footer"/>
+    <w:name w:val="footer"/>
     <w:basedOn w:val="Normal"/>
     <w:link w:val="FooterChar"/>
     <w:uiPriority w:val="99"/>
@@ -2500,7 +2568,7 @@
     <w:rPr/>
   </w:style>
   <w:style w:type="paragraph" w:styleId="IndexHeading">
-    <w:name w:val="Index Heading"/>
+    <w:name w:val="index heading"/>
     <w:basedOn w:val="Heading"/>
     <w:pPr/>
     <w:rPr/>
@@ -2528,7 +2596,7 @@
     </w:rPr>
   </w:style>
   <w:style w:type="paragraph" w:styleId="TOC1">
-    <w:name w:val="TOC 1"/>
+    <w:name w:val="toc 1"/>
     <w:basedOn w:val="Normal"/>
     <w:next w:val="Normal"/>
     <w:autoRedefine/>
@@ -2541,7 +2609,7 @@
     <w:rPr/>
   </w:style>
   <w:style w:type="paragraph" w:styleId="TOC2">
-    <w:name w:val="TOC 2"/>
+    <w:name w:val="toc 2"/>
     <w:basedOn w:val="Normal"/>
     <w:next w:val="Normal"/>
     <w:autoRedefine/>
@@ -2555,7 +2623,7 @@
     <w:rPr/>
   </w:style>
   <w:style w:type="paragraph" w:styleId="TOC3">
-    <w:name w:val="TOC 3"/>
+    <w:name w:val="toc 3"/>
     <w:basedOn w:val="Normal"/>
     <w:next w:val="Normal"/>
     <w:autoRedefine/>
@@ -2629,10 +2697,16 @@
       <w:lang w:val="en-IE" w:eastAsia="en-IE" w:bidi="ar-SA"/>
     </w:rPr>
   </w:style>
+  <w:style w:type="paragraph" w:styleId="FrameContentsuser">
+    <w:name w:val="Frame Contents (user)"/>
+    <w:basedOn w:val="Normal"/>
+    <w:qFormat/>
+    <w:pPr/>
+    <w:rPr/>
+  </w:style>
   <w:style w:type="paragraph" w:styleId="FrameContents">
     <w:name w:val="Frame Contents"/>
     <w:basedOn w:val="Normal"/>
-    <w:qFormat/>
     <w:pPr/>
     <w:rPr/>
   </w:style>
@@ -2687,37 +2761,37 @@
         <a:srgbClr val="000000"/>
       </a:dk1>
       <a:lt1>
-        <a:srgbClr val="ffffff"/>
+        <a:srgbClr val="FFFFFF"/>
       </a:lt1>
       <a:dk2>
-        <a:srgbClr val="0e2841"/>
+        <a:srgbClr val="0E2841"/>
       </a:dk2>
       <a:lt2>
-        <a:srgbClr val="e8e8e8"/>
+        <a:srgbClr val="E8E8E8"/>
       </a:lt2>
       <a:accent1>
         <a:srgbClr val="156082"/>
       </a:accent1>
       <a:accent2>
-        <a:srgbClr val="e97132"/>
+        <a:srgbClr val="E97132"/>
       </a:accent2>
       <a:accent3>
-        <a:srgbClr val="196b24"/>
+        <a:srgbClr val="196B24"/>
       </a:accent3>
       <a:accent4>
-        <a:srgbClr val="0f9ed5"/>
+        <a:srgbClr val="0F9ED5"/>
       </a:accent4>
       <a:accent5>
-        <a:srgbClr val="a02b93"/>
+        <a:srgbClr val="A02B93"/>
       </a:accent5>
       <a:accent6>
-        <a:srgbClr val="4ea72e"/>
+        <a:srgbClr val="4EA72E"/>
       </a:accent6>
       <a:hlink>
         <a:srgbClr val="467886"/>
       </a:hlink>
       <a:folHlink>
-        <a:srgbClr val="96607d"/>
+        <a:srgbClr val="96607D"/>
       </a:folHlink>
     </a:clrScheme>
     <a:fontScheme name="Office">

</xml_diff>